<commit_message>
fix(contrato-rancho-texas): legenda de cada Anexo no topo da propria pagina
O modelo trazia a legenda de cada Anexo (I-IV) no rodape da pagina
anterior ao espaco reservado a ele, deixando as paginas finais do
contrato parecendo em branco/sem identificacao (inclusive uma pagina
solta e totalmente vazia no final, sem titulo nenhum). Ajustado para
cada legenda (Anexo I/II/III/IV) comecar no topo da sua propria
pagina reservada, ficando claro pra quem for imprimir e anexar os
documentos fisicos. Nenhum texto ou clausula foi alterado, so a
quebra de pagina antes de cada titulo de Anexo.

Co-Authored-By: Claude Sonnet 5 <noreply@anthropic.com>
Claude-Session: https://claude.ai/code/session_01JyyZb3Pc2baDxsJbcPo7Na
</commit_message>
<xml_diff>
--- a/backend/app/templates/contratos/contrato_rancho_texas.docx
+++ b/backend/app/templates/contratos/contrato_rancho_texas.docx
@@ -19716,6 +19716,7 @@
     </w:p>
     <w:p>
       <w:pPr>
+        <w:pageBreakBefore/>
         <w:jc w:val="center"/>
         <w:rPr>
           <w:rFonts w:asciiTheme="minorHAnsi" w:hAnsiTheme="minorHAnsi" w:cstheme="minorHAnsi"/>
@@ -20136,6 +20137,7 @@
     </w:p>
     <w:p>
       <w:pPr>
+        <w:pageBreakBefore/>
         <w:jc w:val="center"/>
         <w:rPr>
           <w:rFonts w:asciiTheme="minorHAnsi" w:hAnsiTheme="minorHAnsi" w:cstheme="minorHAnsi"/>
@@ -20554,6 +20556,7 @@
     </w:p>
     <w:p>
       <w:pPr>
+        <w:pageBreakBefore/>
         <w:jc w:val="center"/>
         <w:rPr>
           <w:rFonts w:asciiTheme="minorHAnsi" w:hAnsiTheme="minorHAnsi" w:cstheme="minorHAnsi"/>
@@ -21026,6 +21029,7 @@
     </w:p>
     <w:p>
       <w:pPr>
+        <w:pageBreakBefore/>
         <w:jc w:val="center"/>
         <w:rPr>
           <w:rFonts w:asciiTheme="minorHAnsi" w:hAnsiTheme="minorHAnsi" w:cstheme="minorHAnsi"/>

</xml_diff>